<commit_message>
feat(core): new {{...}} logic with using json_schema_extra={vanish: True}
</commit_message>
<xml_diff>
--- a/src/ecology_chapters/chapter1/template.docx
+++ b/src/ecology_chapters/chapter1/template.docx
@@ -849,7 +849,25 @@
           <w:i/>
           <w:sz w:val="24"/>
         </w:rPr>
-        <w:t>{%if sanitary_zone.size_m %}</w:t>
+        <w:t xml:space="preserve">{%if </w:t>
+      </w:r>
+      <w:r>
+        <w:rPr>
+          <w:rFonts w:ascii="Times New Roman" w:hAnsi="Times New Roman"/>
+          <w:b w:val="false"/>
+          <w:i/>
+          <w:sz w:val="24"/>
+          <w:shd w:fill="FFE779" w:val="clear"/>
+        </w:rPr>
+        <w:t>SANITARY_ZONE_SIZE_M</w:t>
+      </w:r>
+      <w:r>
+        <w:rPr>
+          <w:rFonts w:ascii="Times New Roman" w:hAnsi="Times New Roman"/>
+          <w:i/>
+          <w:sz w:val="24"/>
+        </w:rPr>
+        <w:t xml:space="preserve"> %}</w:t>
       </w:r>
       <w:r>
         <w:rPr>
@@ -1214,6 +1232,7 @@
             <w:pPr>
               <w:pStyle w:val="Normal"/>
               <w:widowControl/>
+              <w:suppressAutoHyphens w:val="true"/>
               <w:spacing w:lineRule="auto" w:line="240" w:before="0" w:after="0"/>
               <w:ind w:hanging="0" w:start="0" w:end="0"/>
               <w:jc w:val="center"/>
@@ -1261,6 +1280,7 @@
             <w:pPr>
               <w:pStyle w:val="Normal"/>
               <w:widowControl/>
+              <w:suppressAutoHyphens w:val="true"/>
               <w:spacing w:lineRule="auto" w:line="240" w:before="0" w:after="0"/>
               <w:ind w:hanging="0" w:start="0" w:end="0"/>
               <w:jc w:val="center"/>
@@ -1296,6 +1316,7 @@
             <w:pPr>
               <w:pStyle w:val="Normal"/>
               <w:widowControl/>
+              <w:suppressAutoHyphens w:val="true"/>
               <w:spacing w:lineRule="auto" w:line="240" w:before="0" w:after="0"/>
               <w:ind w:hanging="0" w:start="0" w:end="0"/>
               <w:jc w:val="center"/>
@@ -1331,6 +1352,7 @@
             <w:pPr>
               <w:pStyle w:val="Normal"/>
               <w:widowControl/>
+              <w:suppressAutoHyphens w:val="true"/>
               <w:spacing w:lineRule="auto" w:line="240" w:before="0" w:after="0"/>
               <w:ind w:hanging="0" w:start="0" w:end="0"/>
               <w:jc w:val="center"/>
@@ -1369,6 +1391,7 @@
             <w:pPr>
               <w:pStyle w:val="Normal"/>
               <w:widowControl/>
+              <w:suppressAutoHyphens w:val="true"/>
               <w:spacing w:lineRule="auto" w:line="240" w:before="0" w:after="0"/>
               <w:ind w:hanging="0" w:start="0" w:end="0"/>
               <w:jc w:val="start"/>
@@ -1404,6 +1427,7 @@
             <w:pPr>
               <w:pStyle w:val="Normal"/>
               <w:widowControl/>
+              <w:suppressAutoHyphens w:val="true"/>
               <w:spacing w:lineRule="auto" w:line="240" w:before="0" w:after="0"/>
               <w:ind w:hanging="0" w:start="0" w:end="0"/>
               <w:jc w:val="start"/>
@@ -1436,6 +1460,7 @@
             <w:pPr>
               <w:pStyle w:val="Normal"/>
               <w:widowControl/>
+              <w:suppressAutoHyphens w:val="true"/>
               <w:spacing w:lineRule="auto" w:line="240" w:before="0" w:after="0"/>
               <w:ind w:hanging="0" w:start="0" w:end="0"/>
               <w:jc w:val="start"/>
@@ -1468,6 +1493,7 @@
             <w:pPr>
               <w:pStyle w:val="Normal"/>
               <w:widowControl/>
+              <w:suppressAutoHyphens w:val="true"/>
               <w:spacing w:lineRule="auto" w:line="240" w:before="0" w:after="0"/>
               <w:ind w:hanging="0" w:start="0" w:end="0"/>
               <w:jc w:val="start"/>
@@ -1503,6 +1529,7 @@
             <w:pPr>
               <w:pStyle w:val="Normal"/>
               <w:widowControl/>
+              <w:suppressAutoHyphens w:val="true"/>
               <w:spacing w:lineRule="auto" w:line="240" w:before="0" w:after="0"/>
               <w:ind w:hanging="0" w:start="0" w:end="0"/>
               <w:jc w:val="center"/>
@@ -1539,6 +1566,7 @@
             <w:pPr>
               <w:pStyle w:val="Normal"/>
               <w:widowControl/>
+              <w:suppressAutoHyphens w:val="true"/>
               <w:spacing w:lineRule="auto" w:line="240" w:before="0" w:after="0"/>
               <w:ind w:hanging="0" w:start="0" w:end="0"/>
               <w:jc w:val="center"/>
@@ -1575,6 +1603,7 @@
             <w:pPr>
               <w:pStyle w:val="Normal"/>
               <w:widowControl/>
+              <w:suppressAutoHyphens w:val="true"/>
               <w:spacing w:lineRule="auto" w:line="240" w:before="0" w:after="0"/>
               <w:ind w:hanging="0" w:start="0" w:end="0"/>
               <w:jc w:val="center"/>
@@ -1611,6 +1640,7 @@
             <w:pPr>
               <w:pStyle w:val="Normal"/>
               <w:widowControl/>
+              <w:suppressAutoHyphens w:val="true"/>
               <w:spacing w:lineRule="auto" w:line="240" w:before="0" w:after="0"/>
               <w:ind w:hanging="0" w:start="0" w:end="0"/>
               <w:jc w:val="center"/>
@@ -1650,6 +1680,7 @@
             <w:pPr>
               <w:pStyle w:val="Normal"/>
               <w:widowControl/>
+              <w:suppressAutoHyphens w:val="true"/>
               <w:spacing w:lineRule="auto" w:line="240" w:before="0" w:after="0"/>
               <w:ind w:hanging="0" w:start="0" w:end="0"/>
               <w:jc w:val="start"/>
@@ -1685,6 +1716,7 @@
             <w:pPr>
               <w:pStyle w:val="Normal"/>
               <w:widowControl/>
+              <w:suppressAutoHyphens w:val="true"/>
               <w:spacing w:lineRule="auto" w:line="240" w:before="0" w:after="0"/>
               <w:ind w:hanging="0" w:start="0" w:end="0"/>
               <w:jc w:val="start"/>
@@ -1717,6 +1749,7 @@
             <w:pPr>
               <w:pStyle w:val="Normal"/>
               <w:widowControl/>
+              <w:suppressAutoHyphens w:val="true"/>
               <w:spacing w:lineRule="auto" w:line="240" w:before="0" w:after="0"/>
               <w:ind w:hanging="0" w:start="0" w:end="0"/>
               <w:jc w:val="start"/>
@@ -1749,6 +1782,7 @@
             <w:pPr>
               <w:pStyle w:val="Normal"/>
               <w:widowControl/>
+              <w:suppressAutoHyphens w:val="true"/>
               <w:spacing w:lineRule="auto" w:line="240" w:before="0" w:after="0"/>
               <w:ind w:hanging="0" w:start="0" w:end="0"/>
               <w:jc w:val="start"/>
@@ -3560,6 +3594,7 @@
             <w:pPr>
               <w:pStyle w:val="Normal"/>
               <w:widowControl/>
+              <w:suppressAutoHyphens w:val="true"/>
               <w:spacing w:lineRule="auto" w:line="240" w:before="0" w:after="0"/>
               <w:ind w:hanging="0" w:start="0" w:end="0"/>
               <w:jc w:val="center"/>
@@ -3595,6 +3630,7 @@
             <w:pPr>
               <w:pStyle w:val="Normal"/>
               <w:widowControl/>
+              <w:suppressAutoHyphens w:val="true"/>
               <w:spacing w:lineRule="auto" w:line="240" w:before="0" w:after="0"/>
               <w:ind w:hanging="0" w:start="0" w:end="0"/>
               <w:jc w:val="center"/>
@@ -3630,6 +3666,7 @@
             <w:pPr>
               <w:pStyle w:val="Normal"/>
               <w:widowControl/>
+              <w:suppressAutoHyphens w:val="true"/>
               <w:spacing w:lineRule="auto" w:line="240" w:before="0" w:after="0"/>
               <w:ind w:hanging="0" w:start="0" w:end="0"/>
               <w:jc w:val="center"/>
@@ -3665,6 +3702,7 @@
             <w:pPr>
               <w:pStyle w:val="Normal"/>
               <w:widowControl/>
+              <w:suppressAutoHyphens w:val="true"/>
               <w:spacing w:lineRule="auto" w:line="240" w:before="0" w:after="0"/>
               <w:ind w:hanging="0" w:start="0" w:end="0"/>
               <w:jc w:val="center"/>
@@ -3703,6 +3741,7 @@
             <w:pPr>
               <w:pStyle w:val="Normal"/>
               <w:widowControl/>
+              <w:suppressAutoHyphens w:val="true"/>
               <w:spacing w:lineRule="auto" w:line="240" w:before="0" w:after="0"/>
               <w:ind w:hanging="0" w:start="0" w:end="0"/>
               <w:jc w:val="start"/>
@@ -3738,6 +3777,7 @@
             <w:pPr>
               <w:pStyle w:val="Normal"/>
               <w:widowControl/>
+              <w:suppressAutoHyphens w:val="true"/>
               <w:spacing w:lineRule="auto" w:line="240" w:before="0" w:after="0"/>
               <w:ind w:hanging="0" w:start="0" w:end="0"/>
               <w:jc w:val="start"/>
@@ -3770,6 +3810,7 @@
             <w:pPr>
               <w:pStyle w:val="Normal"/>
               <w:widowControl/>
+              <w:suppressAutoHyphens w:val="true"/>
               <w:spacing w:lineRule="auto" w:line="240" w:before="0" w:after="0"/>
               <w:ind w:hanging="0" w:start="0" w:end="0"/>
               <w:jc w:val="start"/>
@@ -3802,6 +3843,7 @@
             <w:pPr>
               <w:pStyle w:val="Normal"/>
               <w:widowControl/>
+              <w:suppressAutoHyphens w:val="true"/>
               <w:spacing w:lineRule="auto" w:line="240" w:before="0" w:after="0"/>
               <w:ind w:hanging="0" w:start="0" w:end="0"/>
               <w:jc w:val="start"/>
@@ -3837,6 +3879,7 @@
             <w:pPr>
               <w:pStyle w:val="Normal"/>
               <w:widowControl/>
+              <w:suppressAutoHyphens w:val="true"/>
               <w:spacing w:lineRule="auto" w:line="240" w:before="0" w:after="0"/>
               <w:ind w:hanging="0" w:start="0" w:end="0"/>
               <w:jc w:val="center"/>
@@ -3873,6 +3916,7 @@
             <w:pPr>
               <w:pStyle w:val="Normal"/>
               <w:widowControl/>
+              <w:suppressAutoHyphens w:val="true"/>
               <w:spacing w:lineRule="auto" w:line="240" w:before="0" w:after="0"/>
               <w:ind w:hanging="0" w:start="0" w:end="0"/>
               <w:jc w:val="center"/>
@@ -3909,6 +3953,7 @@
             <w:pPr>
               <w:pStyle w:val="Normal"/>
               <w:widowControl/>
+              <w:suppressAutoHyphens w:val="true"/>
               <w:spacing w:lineRule="auto" w:line="240" w:before="0" w:after="0"/>
               <w:ind w:hanging="0" w:start="0" w:end="0"/>
               <w:jc w:val="center"/>
@@ -3945,6 +3990,7 @@
             <w:pPr>
               <w:pStyle w:val="Normal"/>
               <w:widowControl/>
+              <w:suppressAutoHyphens w:val="true"/>
               <w:spacing w:lineRule="auto" w:line="240" w:before="0" w:after="0"/>
               <w:ind w:hanging="0" w:start="0" w:end="0"/>
               <w:jc w:val="center"/>
@@ -3984,6 +4030,7 @@
             <w:pPr>
               <w:pStyle w:val="Normal"/>
               <w:widowControl/>
+              <w:suppressAutoHyphens w:val="true"/>
               <w:spacing w:lineRule="auto" w:line="240" w:before="0" w:after="0"/>
               <w:ind w:hanging="0" w:start="0" w:end="0"/>
               <w:jc w:val="start"/>
@@ -4019,6 +4066,7 @@
             <w:pPr>
               <w:pStyle w:val="Normal"/>
               <w:widowControl/>
+              <w:suppressAutoHyphens w:val="true"/>
               <w:spacing w:lineRule="auto" w:line="240" w:before="0" w:after="0"/>
               <w:ind w:hanging="0" w:start="0" w:end="0"/>
               <w:jc w:val="start"/>
@@ -4051,6 +4099,7 @@
             <w:pPr>
               <w:pStyle w:val="Normal"/>
               <w:widowControl/>
+              <w:suppressAutoHyphens w:val="true"/>
               <w:spacing w:lineRule="auto" w:line="240" w:before="0" w:after="0"/>
               <w:ind w:hanging="0" w:start="0" w:end="0"/>
               <w:jc w:val="start"/>
@@ -4083,6 +4132,7 @@
             <w:pPr>
               <w:pStyle w:val="Normal"/>
               <w:widowControl/>
+              <w:suppressAutoHyphens w:val="true"/>
               <w:spacing w:lineRule="auto" w:line="240" w:before="0" w:after="0"/>
               <w:ind w:hanging="0" w:start="0" w:end="0"/>
               <w:jc w:val="start"/>
@@ -4118,6 +4168,7 @@
             <w:pPr>
               <w:pStyle w:val="Normal"/>
               <w:widowControl/>
+              <w:suppressAutoHyphens w:val="true"/>
               <w:spacing w:lineRule="auto" w:line="240" w:before="0" w:after="0"/>
               <w:ind w:hanging="0" w:start="0" w:end="0"/>
               <w:jc w:val="center"/>
@@ -4153,6 +4204,7 @@
             <w:pPr>
               <w:pStyle w:val="Normal"/>
               <w:widowControl/>
+              <w:suppressAutoHyphens w:val="true"/>
               <w:spacing w:lineRule="auto" w:line="240" w:before="0" w:after="0"/>
               <w:ind w:hanging="0" w:start="0" w:end="0"/>
               <w:jc w:val="center"/>
@@ -4189,6 +4241,7 @@
             <w:pPr>
               <w:pStyle w:val="Normal"/>
               <w:widowControl/>
+              <w:suppressAutoHyphens w:val="true"/>
               <w:spacing w:lineRule="auto" w:line="240" w:before="0" w:after="0"/>
               <w:ind w:hanging="0" w:start="0" w:end="0"/>
               <w:jc w:val="center"/>
@@ -4225,6 +4278,7 @@
             <w:pPr>
               <w:pStyle w:val="Normal"/>
               <w:widowControl/>
+              <w:suppressAutoHyphens w:val="true"/>
               <w:spacing w:lineRule="auto" w:line="240" w:before="0" w:after="0"/>
               <w:ind w:hanging="0" w:start="0" w:end="0"/>
               <w:jc w:val="center"/>
@@ -5654,6 +5708,7 @@
         </w:tabs>
         <w:ind w:start="1080" w:hanging="360"/>
       </w:pPr>
+      <w:rPr/>
     </w:lvl>
     <w:lvl w:ilvl="2">
       <w:start w:val="1"/>
@@ -5666,6 +5721,7 @@
         </w:tabs>
         <w:ind w:start="1440" w:hanging="360"/>
       </w:pPr>
+      <w:rPr/>
     </w:lvl>
     <w:lvl w:ilvl="3">
       <w:start w:val="1"/>
@@ -5678,6 +5734,7 @@
         </w:tabs>
         <w:ind w:start="1800" w:hanging="360"/>
       </w:pPr>
+      <w:rPr/>
     </w:lvl>
     <w:lvl w:ilvl="4">
       <w:start w:val="1"/>
@@ -5690,6 +5747,7 @@
         </w:tabs>
         <w:ind w:start="2160" w:hanging="360"/>
       </w:pPr>
+      <w:rPr/>
     </w:lvl>
     <w:lvl w:ilvl="5">
       <w:start w:val="1"/>
@@ -5702,6 +5760,7 @@
         </w:tabs>
         <w:ind w:start="2520" w:hanging="360"/>
       </w:pPr>
+      <w:rPr/>
     </w:lvl>
     <w:lvl w:ilvl="6">
       <w:start w:val="1"/>
@@ -5714,6 +5773,7 @@
         </w:tabs>
         <w:ind w:start="2880" w:hanging="360"/>
       </w:pPr>
+      <w:rPr/>
     </w:lvl>
     <w:lvl w:ilvl="7">
       <w:start w:val="1"/>
@@ -5726,6 +5786,7 @@
         </w:tabs>
         <w:ind w:start="3240" w:hanging="360"/>
       </w:pPr>
+      <w:rPr/>
     </w:lvl>
     <w:lvl w:ilvl="8">
       <w:start w:val="1"/>
@@ -5738,6 +5799,7 @@
         </w:tabs>
         <w:ind w:start="3600" w:hanging="360"/>
       </w:pPr>
+      <w:rPr/>
     </w:lvl>
   </w:abstractNum>
   <w:abstractNum w:abstractNumId="2">
@@ -5767,6 +5829,7 @@
         </w:tabs>
         <w:ind w:start="1080" w:hanging="360"/>
       </w:pPr>
+      <w:rPr/>
     </w:lvl>
     <w:lvl w:ilvl="2">
       <w:start w:val="1"/>
@@ -5779,6 +5842,7 @@
         </w:tabs>
         <w:ind w:start="1440" w:hanging="360"/>
       </w:pPr>
+      <w:rPr/>
     </w:lvl>
     <w:lvl w:ilvl="3">
       <w:start w:val="1"/>
@@ -5791,6 +5855,7 @@
         </w:tabs>
         <w:ind w:start="1800" w:hanging="360"/>
       </w:pPr>
+      <w:rPr/>
     </w:lvl>
     <w:lvl w:ilvl="4">
       <w:start w:val="1"/>
@@ -5803,6 +5868,7 @@
         </w:tabs>
         <w:ind w:start="2160" w:hanging="360"/>
       </w:pPr>
+      <w:rPr/>
     </w:lvl>
     <w:lvl w:ilvl="5">
       <w:start w:val="1"/>
@@ -5815,6 +5881,7 @@
         </w:tabs>
         <w:ind w:start="2520" w:hanging="360"/>
       </w:pPr>
+      <w:rPr/>
     </w:lvl>
     <w:lvl w:ilvl="6">
       <w:start w:val="1"/>
@@ -5827,6 +5894,7 @@
         </w:tabs>
         <w:ind w:start="2880" w:hanging="360"/>
       </w:pPr>
+      <w:rPr/>
     </w:lvl>
     <w:lvl w:ilvl="7">
       <w:start w:val="1"/>
@@ -5839,6 +5907,7 @@
         </w:tabs>
         <w:ind w:start="3240" w:hanging="360"/>
       </w:pPr>
+      <w:rPr/>
     </w:lvl>
     <w:lvl w:ilvl="8">
       <w:start w:val="1"/>
@@ -5851,6 +5920,7 @@
         </w:tabs>
         <w:ind w:start="3600" w:hanging="360"/>
       </w:pPr>
+      <w:rPr/>
     </w:lvl>
   </w:abstractNum>
   <w:abstractNum w:abstractNumId="3">
@@ -5878,6 +5948,7 @@
         </w:tabs>
         <w:ind w:start="1080" w:hanging="360"/>
       </w:pPr>
+      <w:rPr/>
     </w:lvl>
     <w:lvl w:ilvl="2">
       <w:start w:val="1"/>
@@ -5890,6 +5961,7 @@
         </w:tabs>
         <w:ind w:start="1440" w:hanging="360"/>
       </w:pPr>
+      <w:rPr/>
     </w:lvl>
     <w:lvl w:ilvl="3">
       <w:start w:val="1"/>
@@ -5902,6 +5974,7 @@
         </w:tabs>
         <w:ind w:start="1800" w:hanging="360"/>
       </w:pPr>
+      <w:rPr/>
     </w:lvl>
     <w:lvl w:ilvl="4">
       <w:start w:val="1"/>
@@ -5914,6 +5987,7 @@
         </w:tabs>
         <w:ind w:start="2160" w:hanging="360"/>
       </w:pPr>
+      <w:rPr/>
     </w:lvl>
     <w:lvl w:ilvl="5">
       <w:start w:val="1"/>
@@ -5926,6 +6000,7 @@
         </w:tabs>
         <w:ind w:start="2520" w:hanging="360"/>
       </w:pPr>
+      <w:rPr/>
     </w:lvl>
     <w:lvl w:ilvl="6">
       <w:start w:val="1"/>
@@ -5938,6 +6013,7 @@
         </w:tabs>
         <w:ind w:start="2880" w:hanging="360"/>
       </w:pPr>
+      <w:rPr/>
     </w:lvl>
     <w:lvl w:ilvl="7">
       <w:start w:val="1"/>
@@ -5950,6 +6026,7 @@
         </w:tabs>
         <w:ind w:start="3240" w:hanging="360"/>
       </w:pPr>
+      <w:rPr/>
     </w:lvl>
     <w:lvl w:ilvl="8">
       <w:start w:val="1"/>
@@ -5962,6 +6039,7 @@
         </w:tabs>
         <w:ind w:start="3600" w:hanging="360"/>
       </w:pPr>
+      <w:rPr/>
     </w:lvl>
   </w:abstractNum>
   <w:abstractNum w:abstractNumId="4">
@@ -5991,6 +6069,7 @@
         </w:tabs>
         <w:ind w:start="1080" w:hanging="360"/>
       </w:pPr>
+      <w:rPr/>
     </w:lvl>
     <w:lvl w:ilvl="2">
       <w:start w:val="1"/>
@@ -6003,6 +6082,7 @@
         </w:tabs>
         <w:ind w:start="1440" w:hanging="360"/>
       </w:pPr>
+      <w:rPr/>
     </w:lvl>
     <w:lvl w:ilvl="3">
       <w:start w:val="1"/>
@@ -6015,6 +6095,7 @@
         </w:tabs>
         <w:ind w:start="1800" w:hanging="360"/>
       </w:pPr>
+      <w:rPr/>
     </w:lvl>
     <w:lvl w:ilvl="4">
       <w:start w:val="1"/>
@@ -6027,6 +6108,7 @@
         </w:tabs>
         <w:ind w:start="2160" w:hanging="360"/>
       </w:pPr>
+      <w:rPr/>
     </w:lvl>
     <w:lvl w:ilvl="5">
       <w:start w:val="1"/>
@@ -6039,6 +6121,7 @@
         </w:tabs>
         <w:ind w:start="2520" w:hanging="360"/>
       </w:pPr>
+      <w:rPr/>
     </w:lvl>
     <w:lvl w:ilvl="6">
       <w:start w:val="1"/>
@@ -6051,6 +6134,7 @@
         </w:tabs>
         <w:ind w:start="2880" w:hanging="360"/>
       </w:pPr>
+      <w:rPr/>
     </w:lvl>
     <w:lvl w:ilvl="7">
       <w:start w:val="1"/>
@@ -6063,6 +6147,7 @@
         </w:tabs>
         <w:ind w:start="3240" w:hanging="360"/>
       </w:pPr>
+      <w:rPr/>
     </w:lvl>
     <w:lvl w:ilvl="8">
       <w:start w:val="1"/>
@@ -6075,6 +6160,7 @@
         </w:tabs>
         <w:ind w:start="3600" w:hanging="360"/>
       </w:pPr>
+      <w:rPr/>
     </w:lvl>
   </w:abstractNum>
   <w:abstractNum w:abstractNumId="5">
@@ -6102,6 +6188,7 @@
         </w:tabs>
         <w:ind w:start="1080" w:hanging="360"/>
       </w:pPr>
+      <w:rPr/>
     </w:lvl>
     <w:lvl w:ilvl="2">
       <w:start w:val="1"/>
@@ -6114,6 +6201,7 @@
         </w:tabs>
         <w:ind w:start="1440" w:hanging="360"/>
       </w:pPr>
+      <w:rPr/>
     </w:lvl>
     <w:lvl w:ilvl="3">
       <w:start w:val="1"/>
@@ -6126,6 +6214,7 @@
         </w:tabs>
         <w:ind w:start="1800" w:hanging="360"/>
       </w:pPr>
+      <w:rPr/>
     </w:lvl>
     <w:lvl w:ilvl="4">
       <w:start w:val="1"/>
@@ -6138,6 +6227,7 @@
         </w:tabs>
         <w:ind w:start="2160" w:hanging="360"/>
       </w:pPr>
+      <w:rPr/>
     </w:lvl>
     <w:lvl w:ilvl="5">
       <w:start w:val="1"/>
@@ -6150,6 +6240,7 @@
         </w:tabs>
         <w:ind w:start="2520" w:hanging="360"/>
       </w:pPr>
+      <w:rPr/>
     </w:lvl>
     <w:lvl w:ilvl="6">
       <w:start w:val="1"/>
@@ -6162,6 +6253,7 @@
         </w:tabs>
         <w:ind w:start="2880" w:hanging="360"/>
       </w:pPr>
+      <w:rPr/>
     </w:lvl>
     <w:lvl w:ilvl="7">
       <w:start w:val="1"/>
@@ -6174,6 +6266,7 @@
         </w:tabs>
         <w:ind w:start="3240" w:hanging="360"/>
       </w:pPr>
+      <w:rPr/>
     </w:lvl>
     <w:lvl w:ilvl="8">
       <w:start w:val="1"/>
@@ -6186,6 +6279,7 @@
         </w:tabs>
         <w:ind w:start="3600" w:hanging="360"/>
       </w:pPr>
+      <w:rPr/>
     </w:lvl>
   </w:abstractNum>
   <w:abstractNum w:abstractNumId="6">
@@ -6215,6 +6309,7 @@
         </w:tabs>
         <w:ind w:start="1080" w:hanging="360"/>
       </w:pPr>
+      <w:rPr/>
     </w:lvl>
     <w:lvl w:ilvl="2">
       <w:start w:val="1"/>
@@ -6227,6 +6322,7 @@
         </w:tabs>
         <w:ind w:start="1440" w:hanging="360"/>
       </w:pPr>
+      <w:rPr/>
     </w:lvl>
     <w:lvl w:ilvl="3">
       <w:start w:val="1"/>
@@ -6239,6 +6335,7 @@
         </w:tabs>
         <w:ind w:start="1800" w:hanging="360"/>
       </w:pPr>
+      <w:rPr/>
     </w:lvl>
     <w:lvl w:ilvl="4">
       <w:start w:val="1"/>
@@ -6251,6 +6348,7 @@
         </w:tabs>
         <w:ind w:start="2160" w:hanging="360"/>
       </w:pPr>
+      <w:rPr/>
     </w:lvl>
     <w:lvl w:ilvl="5">
       <w:start w:val="1"/>
@@ -6263,6 +6361,7 @@
         </w:tabs>
         <w:ind w:start="2520" w:hanging="360"/>
       </w:pPr>
+      <w:rPr/>
     </w:lvl>
     <w:lvl w:ilvl="6">
       <w:start w:val="1"/>
@@ -6275,6 +6374,7 @@
         </w:tabs>
         <w:ind w:start="2880" w:hanging="360"/>
       </w:pPr>
+      <w:rPr/>
     </w:lvl>
     <w:lvl w:ilvl="7">
       <w:start w:val="1"/>
@@ -6287,6 +6387,7 @@
         </w:tabs>
         <w:ind w:start="3240" w:hanging="360"/>
       </w:pPr>
+      <w:rPr/>
     </w:lvl>
     <w:lvl w:ilvl="8">
       <w:start w:val="1"/>
@@ -6299,6 +6400,7 @@
         </w:tabs>
         <w:ind w:start="3600" w:hanging="360"/>
       </w:pPr>
+      <w:rPr/>
     </w:lvl>
   </w:abstractNum>
   <w:abstractNum w:abstractNumId="7">
@@ -6494,6 +6596,7 @@
     <w:qFormat/>
     <w:pPr>
       <w:widowControl/>
+      <w:suppressAutoHyphens w:val="true"/>
       <w:bidi w:val="0"/>
       <w:spacing w:lineRule="auto" w:line="276" w:before="0" w:after="200"/>
       <w:ind w:hanging="0" w:start="0" w:end="0"/>
@@ -7186,6 +7289,32 @@
       <w:rFonts w:cs="Arial"/>
     </w:rPr>
   </w:style>
+  <w:style w:type="paragraph" w:styleId="user">
+    <w:name w:val="Заголовок (user)"/>
+    <w:basedOn w:val="Normal"/>
+    <w:next w:val="BodyText"/>
+    <w:qFormat/>
+    <w:pPr>
+      <w:keepNext w:val="true"/>
+      <w:spacing w:before="240" w:after="120"/>
+    </w:pPr>
+    <w:rPr>
+      <w:rFonts w:ascii="Liberation Sans" w:hAnsi="Liberation Sans" w:eastAsia="Microsoft YaHei" w:cs="Arial"/>
+      <w:sz w:val="28"/>
+      <w:szCs w:val="28"/>
+    </w:rPr>
+  </w:style>
+  <w:style w:type="paragraph" w:styleId="user1">
+    <w:name w:val="Указатель (user)"/>
+    <w:basedOn w:val="Normal"/>
+    <w:qFormat/>
+    <w:pPr>
+      <w:suppressLineNumbers/>
+    </w:pPr>
+    <w:rPr>
+      <w:rFonts w:cs="Arial"/>
+    </w:rPr>
+  </w:style>
   <w:style w:type="paragraph" w:styleId="ListNumber2">
     <w:name w:val="List Number 2"/>
     <w:basedOn w:val="Normal"/>
@@ -7218,6 +7347,7 @@
     <w:uiPriority w:val="39"/>
     <w:pPr>
       <w:widowControl/>
+      <w:suppressAutoHyphens w:val="true"/>
       <w:bidi w:val="0"/>
       <w:spacing w:lineRule="auto" w:line="276" w:before="0" w:after="200"/>
       <w:ind w:hanging="0" w:start="200" w:end="0"/>
@@ -7253,6 +7383,7 @@
     <w:uiPriority w:val="39"/>
     <w:pPr>
       <w:widowControl/>
+      <w:suppressAutoHyphens w:val="true"/>
       <w:bidi w:val="0"/>
       <w:spacing w:lineRule="auto" w:line="276" w:before="0" w:after="200"/>
       <w:ind w:hanging="0" w:start="600" w:end="0"/>
@@ -7274,6 +7405,7 @@
     <w:uiPriority w:val="39"/>
     <w:pPr>
       <w:widowControl/>
+      <w:suppressAutoHyphens w:val="true"/>
       <w:bidi w:val="0"/>
       <w:spacing w:lineRule="auto" w:line="276" w:before="0" w:after="200"/>
       <w:ind w:hanging="0" w:start="1000" w:end="0"/>
@@ -7295,6 +7427,7 @@
     <w:uiPriority w:val="39"/>
     <w:pPr>
       <w:widowControl/>
+      <w:suppressAutoHyphens w:val="true"/>
       <w:bidi w:val="0"/>
       <w:spacing w:lineRule="auto" w:line="276" w:before="0" w:after="200"/>
       <w:ind w:hanging="0" w:start="1200" w:end="0"/>
@@ -7316,6 +7449,7 @@
     <w:qFormat/>
     <w:pPr>
       <w:widowControl/>
+      <w:suppressAutoHyphens w:val="true"/>
       <w:bidi w:val="0"/>
       <w:spacing w:lineRule="auto" w:line="240" w:before="0" w:after="0"/>
       <w:ind w:hanging="0" w:start="0" w:end="0"/>
@@ -7346,6 +7480,7 @@
     <w:qFormat/>
     <w:pPr>
       <w:widowControl/>
+      <w:suppressAutoHyphens w:val="true"/>
       <w:bidi w:val="0"/>
       <w:spacing w:lineRule="auto" w:line="276" w:before="0" w:after="200"/>
       <w:ind w:firstLine="851" w:start="0" w:end="0"/>
@@ -7387,7 +7522,7 @@
   </w:style>
   <w:style w:type="paragraph" w:styleId="IndexHeading">
     <w:name w:val="index heading"/>
-    <w:basedOn w:val="Style5"/>
+    <w:basedOn w:val="user"/>
     <w:pPr/>
     <w:rPr/>
   </w:style>
@@ -7494,6 +7629,7 @@
     <w:uiPriority w:val="39"/>
     <w:pPr>
       <w:widowControl/>
+      <w:suppressAutoHyphens w:val="true"/>
       <w:bidi w:val="0"/>
       <w:spacing w:lineRule="auto" w:line="276" w:before="0" w:after="200"/>
       <w:ind w:hanging="0" w:start="400" w:end="0"/>
@@ -7534,11 +7670,12 @@
     </w:pPr>
     <w:rPr/>
   </w:style>
-  <w:style w:type="paragraph" w:styleId="Style7">
-    <w:name w:val="Колонтитулы"/>
+  <w:style w:type="paragraph" w:styleId="user2">
+    <w:name w:val="Колонтитулы (user)"/>
     <w:qFormat/>
     <w:pPr>
       <w:widowControl/>
+      <w:suppressAutoHyphens w:val="true"/>
       <w:bidi w:val="0"/>
       <w:spacing w:lineRule="auto" w:line="240" w:before="0" w:after="200"/>
       <w:ind w:hanging="0" w:start="0" w:end="0"/>
@@ -7554,6 +7691,13 @@
       <w:lang w:val="ru-RU" w:eastAsia="zh-CN" w:bidi="hi-IN"/>
     </w:rPr>
   </w:style>
+  <w:style w:type="paragraph" w:styleId="Style7">
+    <w:name w:val="Колонтитулы"/>
+    <w:basedOn w:val="Normal"/>
+    <w:qFormat/>
+    <w:pPr/>
+    <w:rPr/>
+  </w:style>
   <w:style w:type="paragraph" w:styleId="Header">
     <w:name w:val="header"/>
     <w:basedOn w:val="Normal"/>
@@ -7610,6 +7754,7 @@
     <w:qFormat/>
     <w:pPr>
       <w:widowControl/>
+      <w:suppressAutoHyphens w:val="true"/>
       <w:bidi w:val="0"/>
       <w:spacing w:lineRule="auto" w:line="276" w:before="0" w:after="200"/>
       <w:ind w:hanging="0" w:start="0" w:end="0"/>
@@ -7632,6 +7777,7 @@
     <w:qFormat/>
     <w:pPr>
       <w:widowControl/>
+      <w:suppressAutoHyphens w:val="true"/>
       <w:bidi w:val="0"/>
       <w:spacing w:lineRule="auto" w:line="276" w:before="0" w:after="200"/>
       <w:ind w:firstLine="851" w:start="0" w:end="0"/>
@@ -7653,6 +7799,7 @@
     <w:uiPriority w:val="39"/>
     <w:pPr>
       <w:widowControl/>
+      <w:suppressAutoHyphens w:val="true"/>
       <w:bidi w:val="0"/>
       <w:spacing w:lineRule="auto" w:line="276" w:before="0" w:after="200"/>
       <w:ind w:hanging="0" w:start="0" w:end="0"/>
@@ -7675,6 +7822,7 @@
     <w:uiPriority w:val="39"/>
     <w:pPr>
       <w:widowControl/>
+      <w:suppressAutoHyphens w:val="true"/>
       <w:bidi w:val="0"/>
       <w:spacing w:lineRule="auto" w:line="276" w:before="0" w:after="200"/>
       <w:ind w:hanging="0" w:start="1600" w:end="0"/>
@@ -7705,6 +7853,7 @@
     <w:uiPriority w:val="39"/>
     <w:pPr>
       <w:widowControl/>
+      <w:suppressAutoHyphens w:val="true"/>
       <w:bidi w:val="0"/>
       <w:spacing w:lineRule="auto" w:line="276" w:before="0" w:after="200"/>
       <w:ind w:hanging="0" w:start="1400" w:end="0"/>
@@ -7726,6 +7875,7 @@
     <w:qFormat/>
     <w:pPr>
       <w:widowControl/>
+      <w:suppressAutoHyphens w:val="true"/>
       <w:bidi w:val="0"/>
       <w:spacing w:lineRule="auto" w:line="276" w:before="0" w:after="200"/>
       <w:ind w:hanging="0" w:start="0" w:end="0"/>
@@ -7747,6 +7897,7 @@
     <w:uiPriority w:val="39"/>
     <w:pPr>
       <w:widowControl/>
+      <w:suppressAutoHyphens w:val="true"/>
       <w:bidi w:val="0"/>
       <w:spacing w:lineRule="auto" w:line="276" w:before="0" w:after="200"/>
       <w:ind w:hanging="0" w:start="800" w:end="0"/>
@@ -7848,6 +7999,7 @@
         <w:tab w:val="left" w:pos="3456" w:leader="none"/>
         <w:tab w:val="left" w:pos="4032" w:leader="none"/>
       </w:tabs>
+      <w:suppressAutoHyphens w:val="true"/>
       <w:bidi w:val="0"/>
       <w:spacing w:lineRule="auto" w:line="276" w:before="0" w:after="200"/>
       <w:ind w:hanging="0" w:start="0" w:end="0"/>

</xml_diff>